<commit_message>
update pseudocode docx files
</commit_message>
<xml_diff>
--- a/src/tinycua/docs/pseudocode/Algorithm2_Worker_Node.docx
+++ b/src/tinycua/docs/pseudocode/Algorithm2_Worker_Node.docx
@@ -2,24 +2,12 @@
 <file path=word/document.xml><?xml version="1.0" encoding="utf-8"?>
 <w:document xmlns:wpc="http://schemas.microsoft.com/office/word/2010/wordprocessingCanvas" xmlns:cx="http://schemas.microsoft.com/office/drawing/2014/chartex" xmlns:cx1="http://schemas.microsoft.com/office/drawing/2015/9/8/chartex" xmlns:cx2="http://schemas.microsoft.com/office/drawing/2015/10/21/chartex" xmlns:cx3="http://schemas.microsoft.com/office/drawing/2016/5/9/chartex" xmlns:cx4="http://schemas.microsoft.com/office/drawing/2016/5/10/chartex" xmlns:cx5="http://schemas.microsoft.com/office/drawing/2016/5/11/chartex" xmlns:cx6="http://schemas.microsoft.com/office/drawing/2016/5/12/chartex" xmlns:cx7="http://schemas.microsoft.com/office/drawing/2016/5/13/chartex" xmlns:cx8="http://schemas.microsoft.com/office/drawing/2016/5/14/chartex" xmlns:mc="http://schemas.openxmlformats.org/markup-compatibility/2006" xmlns:m="http://schemas.openxmlformats.org/officeDocument/2006/math" xmlns:aink="http://schemas.microsoft.com/office/drawing/2016/ink" xmlns:am3d="http://schemas.microsoft.com/office/drawing/2017/model3d" xmlns:oel="http://schemas.microsoft.com/office/2019/extlst" xmlns:r="http://schemas.openxmlformats.org/officeDocument/2006/relationships" xmlns:wp14="http://schemas.microsoft.com/office/word/2010/wordprocessingDrawing" xmlns:wp="http://schemas.openxmlformats.org/drawingml/2006/wordprocessingDrawing" xmlns:wpg="http://schemas.microsoft.com/office/word/2010/wordprocessingGroup" xmlns:wpi="http://schemas.microsoft.com/office/word/2010/wordprocessingInk" xmlns:wps="http://schemas.microsoft.com/office/word/2010/wordprocessingShape" xmlns:o="urn:schemas-microsoft-com:office:office" xmlns:v="urn:schemas-microsoft-com:vml" xmlns:w10="urn:schemas-microsoft-com:office:word" xmlns:w="http://schemas.openxmlformats.org/wordprocessingml/2006/main" xmlns:w14="http://schemas.microsoft.com/office/word/2010/wordml" xmlns:w15="http://schemas.microsoft.com/office/word/2012/wordml" xmlns:w16cei="http://schemas.microsoft.com/office/word/2026/wordml/cei" xmlns:w16cex="http://schemas.microsoft.com/office/word/2018/wordml/cex" xmlns:w16cid="http://schemas.microsoft.com/office/word/2016/wordml/cid" xmlns:w16="http://schemas.microsoft.com/office/word/2018/wordml" xmlns:w16sdtdh="http://schemas.microsoft.com/office/word/2020/wordml/sdtdatahash" xmlns:w16sdtfl="http://schemas.microsoft.com/office/word/2024/wordml/sdtformatlock" xmlns:w16se="http://schemas.microsoft.com/office/word/2015/wordml/symex" xmlns:w16du="http://schemas.microsoft.com/office/word/2023/wordml/word16du" xmlns:wne="http://schemas.microsoft.com/office/word/2006/wordml" mc:Ignorable="w14 w15 w16se w16cid w16 w16cex w16sdtdh w16sdtfl w16du wp14">
   <w:body>
-    <w:p>
-      <w:pPr>
-        <w:pBdr>
-          <w:bottom w:val="single" w:sz="4" w:space="1" w:color="000000"/>
-        </w:pBdr>
-        <w:spacing w:after="0"/>
-      </w:pPr>
-      <w:r>
-        <w:rPr>
-          <w:b/>
-          <w:sz w:val="24"/>
-        </w:rPr>
-        <w:t>Algorithm 2: Worker Node</w:t>
-      </w:r>
-    </w:p>
     <w:tbl>
       <w:tblPr>
         <w:tblW w:w="0" w:type="auto"/>
+        <w:tblBorders>
+          <w:bottom w:val="single" w:sz="4" w:space="0" w:color="auto"/>
+        </w:tblBorders>
         <w:tblLook w:val="04A0" w:firstRow="1" w:lastRow="0" w:firstColumn="1" w:lastColumn="0" w:noHBand="0" w:noVBand="1"/>
       </w:tblPr>
       <w:tblGrid>
@@ -29,26 +17,105 @@
       <w:tr>
         <w:tc>
           <w:tcPr>
-            <w:tcW w:w="680" w:type="dxa"/>
+            <w:tcW w:w="9184" w:type="dxa"/>
+            <w:gridSpan w:val="2"/>
+            <w:tcBorders>
+              <w:top w:val="single" w:sz="4" w:space="0" w:color="auto"/>
+              <w:bottom w:val="single" w:sz="4" w:space="0" w:color="auto"/>
+            </w:tcBorders>
           </w:tcPr>
           <w:p>
             <w:pPr>
               <w:spacing w:before="20" w:after="20"/>
+              <w:rPr>
+                <w:sz w:val="20"/>
+                <w:szCs w:val="20"/>
+              </w:rPr>
+            </w:pPr>
+            <w:r>
+              <w:rPr>
+                <w:rFonts w:eastAsia="SimSun" w:cs="Times New Roman"/>
+                <w:b/>
+                <w:bCs/>
+                <w:sz w:val="20"/>
+                <w:szCs w:val="20"/>
+              </w:rPr>
+              <w:t xml:space="preserve">Algorithm </w:t>
+            </w:r>
+            <w:r>
+              <w:rPr>
+                <w:rFonts w:eastAsia="SimSun" w:cs="Times New Roman"/>
+                <w:b/>
+                <w:bCs/>
+                <w:sz w:val="20"/>
+                <w:szCs w:val="20"/>
+              </w:rPr>
+              <w:t>2</w:t>
+            </w:r>
+            <w:r>
+              <w:rPr>
+                <w:rFonts w:eastAsia="SimSun" w:cs="Times New Roman"/>
+                <w:b/>
+                <w:bCs/>
+                <w:sz w:val="20"/>
+                <w:szCs w:val="20"/>
+              </w:rPr>
+              <w:t xml:space="preserve">: </w:t>
+            </w:r>
+            <w:r>
+              <w:rPr>
+                <w:rFonts w:eastAsia="SimSun" w:cs="Times New Roman"/>
+                <w:b/>
+                <w:bCs/>
+                <w:sz w:val="20"/>
+                <w:szCs w:val="20"/>
+              </w:rPr>
+              <w:t>WorkerNode</w:t>
+            </w:r>
+          </w:p>
+        </w:tc>
+      </w:tr>
+      <w:tr>
+        <w:tc>
+          <w:tcPr>
+            <w:tcW w:w="680" w:type="dxa"/>
+            <w:tcBorders>
+              <w:top w:val="single" w:sz="4" w:space="0" w:color="auto"/>
+            </w:tcBorders>
+          </w:tcPr>
+          <w:p>
+            <w:pPr>
+              <w:spacing w:before="20" w:after="20"/>
+              <w:rPr>
+                <w:sz w:val="20"/>
+                <w:szCs w:val="20"/>
+              </w:rPr>
             </w:pPr>
           </w:p>
         </w:tc>
         <w:tc>
           <w:tcPr>
             <w:tcW w:w="8504" w:type="dxa"/>
+            <w:tcBorders>
+              <w:top w:val="single" w:sz="4" w:space="0" w:color="auto"/>
+            </w:tcBorders>
           </w:tcPr>
           <w:p>
             <w:pPr>
               <w:spacing w:before="20" w:after="20"/>
+              <w:rPr>
+                <w:i/>
+                <w:color w:val="808080"/>
+                <w:sz w:val="20"/>
+                <w:szCs w:val="20"/>
+              </w:rPr>
             </w:pPr>
             <w:r>
               <w:rPr>
                 <w:i/>
                 <w:color w:val="808080"/>
+                <w:sz w:val="20"/>
+                <w:szCs w:val="20"/>
               </w:rPr>
               <w:t xml:space="preserve">    // Deduplication guard</w:t>
             </w:r>
@@ -65,12 +132,16 @@
               <w:spacing w:before="20" w:after="20"/>
               <w:rPr>
                 <w:rFonts w:cs="Times New Roman"/>
+                <w:sz w:val="20"/>
+                <w:szCs w:val="20"/>
               </w:rPr>
             </w:pPr>
             <w:r>
               <w:rPr>
                 <w:rFonts w:cs="Times New Roman"/>
                 <w:color w:val="000000"/>
+                <w:sz w:val="20"/>
+                <w:szCs w:val="20"/>
               </w:rPr>
               <w:t>1:</w:t>
             </w:r>
@@ -85,6 +156,8 @@
               <w:spacing w:before="20" w:after="20"/>
               <w:rPr>
                 <w:rFonts w:cs="Times New Roman"/>
+                <w:sz w:val="20"/>
+                <w:szCs w:val="20"/>
               </w:rPr>
             </w:pPr>
             <w:r>
@@ -92,6 +165,8 @@
                 <w:rFonts w:cs="Times New Roman"/>
                 <w:b/>
                 <w:color w:val="000000"/>
+                <w:sz w:val="20"/>
+                <w:szCs w:val="20"/>
               </w:rPr>
               <w:t>if</w:t>
             </w:r>
@@ -99,6 +174,8 @@
               <w:rPr>
                 <w:rFonts w:cs="Times New Roman"/>
                 <w:color w:val="000000"/>
+                <w:sz w:val="20"/>
+                <w:szCs w:val="20"/>
               </w:rPr>
               <w:t xml:space="preserve"> </w:t>
             </w:r>
@@ -107,6 +184,8 @@
                 <w:rFonts w:cs="Times New Roman"/>
                 <w:i/>
                 <w:color w:val="000000"/>
+                <w:sz w:val="20"/>
+                <w:szCs w:val="20"/>
               </w:rPr>
               <w:t>existingWorker</w:t>
             </w:r>
@@ -114,6 +193,8 @@
               <w:rPr>
                 <w:rFonts w:cs="Times New Roman"/>
                 <w:color w:val="000000"/>
+                <w:sz w:val="20"/>
+                <w:szCs w:val="20"/>
               </w:rPr>
               <w:t xml:space="preserve"> ≠ </w:t>
             </w:r>
@@ -123,6 +204,8 @@
                 <w:b/>
                 <w:caps/>
                 <w:color w:val="000000"/>
+                <w:sz w:val="20"/>
+                <w:szCs w:val="20"/>
               </w:rPr>
               <w:t>NULL</w:t>
             </w:r>
@@ -130,6 +213,8 @@
               <w:rPr>
                 <w:rFonts w:cs="Times New Roman"/>
                 <w:color w:val="000000"/>
+                <w:sz w:val="20"/>
+                <w:szCs w:val="20"/>
               </w:rPr>
               <w:t xml:space="preserve"> </w:t>
             </w:r>
@@ -138,6 +223,8 @@
                 <w:rFonts w:cs="Times New Roman"/>
                 <w:b/>
                 <w:color w:val="000000"/>
+                <w:sz w:val="20"/>
+                <w:szCs w:val="20"/>
               </w:rPr>
               <w:t>then</w:t>
             </w:r>
@@ -154,12 +241,16 @@
               <w:spacing w:before="20" w:after="20"/>
               <w:rPr>
                 <w:rFonts w:cs="Times New Roman"/>
+                <w:sz w:val="20"/>
+                <w:szCs w:val="20"/>
               </w:rPr>
             </w:pPr>
             <w:r>
               <w:rPr>
                 <w:rFonts w:cs="Times New Roman"/>
                 <w:color w:val="000000"/>
+                <w:sz w:val="20"/>
+                <w:szCs w:val="20"/>
               </w:rPr>
               <w:t>2:</w:t>
             </w:r>
@@ -174,12 +265,16 @@
               <w:spacing w:before="20" w:after="20"/>
               <w:rPr>
                 <w:rFonts w:cs="Times New Roman"/>
+                <w:sz w:val="20"/>
+                <w:szCs w:val="20"/>
               </w:rPr>
             </w:pPr>
             <w:r>
               <w:rPr>
                 <w:rFonts w:cs="Times New Roman"/>
                 <w:color w:val="000000"/>
+                <w:sz w:val="20"/>
+                <w:szCs w:val="20"/>
               </w:rPr>
               <w:t xml:space="preserve">    </w:t>
             </w:r>
@@ -188,6 +283,8 @@
                 <w:rFonts w:cs="Times New Roman"/>
                 <w:i/>
                 <w:color w:val="000000"/>
+                <w:sz w:val="20"/>
+                <w:szCs w:val="20"/>
               </w:rPr>
               <w:t>existingWorker.input</w:t>
             </w:r>
@@ -195,6 +292,8 @@
               <w:rPr>
                 <w:rFonts w:cs="Times New Roman"/>
                 <w:color w:val="000000"/>
+                <w:sz w:val="20"/>
+                <w:szCs w:val="20"/>
               </w:rPr>
               <w:t xml:space="preserve"> ← </w:t>
             </w:r>
@@ -203,6 +302,8 @@
                 <w:rFonts w:cs="Times New Roman"/>
                 <w:i/>
                 <w:color w:val="000000"/>
+                <w:sz w:val="20"/>
+                <w:szCs w:val="20"/>
               </w:rPr>
               <w:t>digestedContext</w:t>
             </w:r>
@@ -219,12 +320,16 @@
               <w:spacing w:before="20" w:after="20"/>
               <w:rPr>
                 <w:rFonts w:cs="Times New Roman"/>
+                <w:sz w:val="20"/>
+                <w:szCs w:val="20"/>
               </w:rPr>
             </w:pPr>
             <w:r>
               <w:rPr>
                 <w:rFonts w:cs="Times New Roman"/>
                 <w:color w:val="000000"/>
+                <w:sz w:val="20"/>
+                <w:szCs w:val="20"/>
               </w:rPr>
               <w:t>3:</w:t>
             </w:r>
@@ -239,12 +344,16 @@
               <w:spacing w:before="20" w:after="20"/>
               <w:rPr>
                 <w:rFonts w:cs="Times New Roman"/>
+                <w:sz w:val="20"/>
+                <w:szCs w:val="20"/>
               </w:rPr>
             </w:pPr>
             <w:r>
               <w:rPr>
                 <w:rFonts w:cs="Times New Roman"/>
                 <w:color w:val="000000"/>
+                <w:sz w:val="20"/>
+                <w:szCs w:val="20"/>
               </w:rPr>
               <w:t xml:space="preserve">    </w:t>
             </w:r>
@@ -253,6 +362,8 @@
                 <w:rFonts w:cs="Times New Roman"/>
                 <w:b/>
                 <w:color w:val="000000"/>
+                <w:sz w:val="20"/>
+                <w:szCs w:val="20"/>
               </w:rPr>
               <w:t>return</w:t>
             </w:r>
@@ -269,12 +380,16 @@
               <w:spacing w:before="20" w:after="20"/>
               <w:rPr>
                 <w:rFonts w:cs="Times New Roman"/>
+                <w:sz w:val="20"/>
+                <w:szCs w:val="20"/>
               </w:rPr>
             </w:pPr>
             <w:r>
               <w:rPr>
                 <w:rFonts w:cs="Times New Roman"/>
                 <w:color w:val="000000"/>
+                <w:sz w:val="20"/>
+                <w:szCs w:val="20"/>
               </w:rPr>
               <w:t>4:</w:t>
             </w:r>
@@ -289,6 +404,8 @@
               <w:spacing w:before="20" w:after="20"/>
               <w:rPr>
                 <w:rFonts w:cs="Times New Roman"/>
+                <w:sz w:val="20"/>
+                <w:szCs w:val="20"/>
               </w:rPr>
             </w:pPr>
             <w:r>
@@ -296,6 +413,8 @@
                 <w:rFonts w:cs="Times New Roman"/>
                 <w:b/>
                 <w:color w:val="000000"/>
+                <w:sz w:val="20"/>
+                <w:szCs w:val="20"/>
               </w:rPr>
               <w:t>end if</w:t>
             </w:r>
@@ -312,6 +431,8 @@
               <w:spacing w:before="20" w:after="20"/>
               <w:rPr>
                 <w:rFonts w:cs="Times New Roman"/>
+                <w:sz w:val="20"/>
+                <w:szCs w:val="20"/>
               </w:rPr>
             </w:pPr>
           </w:p>
@@ -325,6 +446,8 @@
               <w:spacing w:before="20" w:after="20"/>
               <w:rPr>
                 <w:rFonts w:cs="Times New Roman"/>
+                <w:sz w:val="20"/>
+                <w:szCs w:val="20"/>
               </w:rPr>
             </w:pPr>
             <w:r>
@@ -332,8 +455,10 @@
                 <w:rFonts w:cs="Times New Roman"/>
                 <w:i/>
                 <w:color w:val="808080"/>
-              </w:rPr>
-              <w:t xml:space="preserve">    // Step 2: Check if task exists</w:t>
+                <w:sz w:val="20"/>
+                <w:szCs w:val="20"/>
+              </w:rPr>
+              <w:t xml:space="preserve">    // Check if task exists</w:t>
             </w:r>
           </w:p>
         </w:tc>
@@ -348,12 +473,16 @@
               <w:spacing w:before="20" w:after="20"/>
               <w:rPr>
                 <w:rFonts w:cs="Times New Roman"/>
+                <w:sz w:val="20"/>
+                <w:szCs w:val="20"/>
               </w:rPr>
             </w:pPr>
             <w:r>
               <w:rPr>
                 <w:rFonts w:cs="Times New Roman"/>
                 <w:color w:val="000000"/>
+                <w:sz w:val="20"/>
+                <w:szCs w:val="20"/>
               </w:rPr>
               <w:t>5:</w:t>
             </w:r>
@@ -368,6 +497,8 @@
               <w:spacing w:before="20" w:after="20"/>
               <w:rPr>
                 <w:rFonts w:cs="Times New Roman"/>
+                <w:sz w:val="20"/>
+                <w:szCs w:val="20"/>
               </w:rPr>
             </w:pPr>
             <w:r>
@@ -375,6 +506,8 @@
                 <w:rFonts w:cs="Times New Roman"/>
                 <w:i/>
                 <w:color w:val="000000"/>
+                <w:sz w:val="20"/>
+                <w:szCs w:val="20"/>
               </w:rPr>
               <w:t>taskExists</w:t>
             </w:r>
@@ -382,15 +515,18 @@
               <w:rPr>
                 <w:rFonts w:cs="Times New Roman"/>
                 <w:color w:val="000000"/>
+                <w:sz w:val="20"/>
+                <w:szCs w:val="20"/>
               </w:rPr>
               <w:t xml:space="preserve"> ← </w:t>
             </w:r>
-            <w:proofErr w:type="gramStart"/>
             <w:r>
               <w:rPr>
                 <w:rFonts w:cs="Times New Roman"/>
                 <w:i/>
                 <w:color w:val="000000"/>
+                <w:sz w:val="20"/>
+                <w:szCs w:val="20"/>
               </w:rPr>
               <w:t>queue</w:t>
             </w:r>
@@ -398,23 +534,26 @@
               <w:rPr>
                 <w:rFonts w:cs="Times New Roman"/>
                 <w:color w:val="000000"/>
+                <w:sz w:val="20"/>
+                <w:szCs w:val="20"/>
               </w:rPr>
               <w:t>.</w:t>
             </w:r>
             <w:r>
               <w:rPr>
                 <w:rFonts w:cs="Times New Roman"/>
-                <w:b/>
-                <w:caps/>
                 <w:color w:val="000000"/>
-              </w:rPr>
-              <w:t>hasTask</w:t>
+                <w:sz w:val="20"/>
+                <w:szCs w:val="20"/>
+              </w:rPr>
+              <w:t>HasTask</w:t>
             </w:r>
-            <w:proofErr w:type="gramEnd"/>
             <w:r>
               <w:rPr>
                 <w:rFonts w:cs="Times New Roman"/>
                 <w:color w:val="000000"/>
+                <w:sz w:val="20"/>
+                <w:szCs w:val="20"/>
               </w:rPr>
               <w:t>()</w:t>
             </w:r>
@@ -431,6 +570,8 @@
               <w:spacing w:before="20" w:after="20"/>
               <w:rPr>
                 <w:rFonts w:cs="Times New Roman"/>
+                <w:sz w:val="20"/>
+                <w:szCs w:val="20"/>
               </w:rPr>
             </w:pPr>
           </w:p>
@@ -444,6 +585,8 @@
               <w:spacing w:before="20" w:after="20"/>
               <w:rPr>
                 <w:rFonts w:cs="Times New Roman"/>
+                <w:sz w:val="20"/>
+                <w:szCs w:val="20"/>
               </w:rPr>
             </w:pPr>
             <w:r>
@@ -451,8 +594,10 @@
                 <w:rFonts w:cs="Times New Roman"/>
                 <w:i/>
                 <w:color w:val="808080"/>
-              </w:rPr>
-              <w:t xml:space="preserve">    // Step 3: Analysis call</w:t>
+                <w:sz w:val="20"/>
+                <w:szCs w:val="20"/>
+              </w:rPr>
+              <w:t xml:space="preserve">    // Analysis call</w:t>
             </w:r>
           </w:p>
         </w:tc>
@@ -467,12 +612,16 @@
               <w:spacing w:before="20" w:after="20"/>
               <w:rPr>
                 <w:rFonts w:cs="Times New Roman"/>
+                <w:sz w:val="20"/>
+                <w:szCs w:val="20"/>
               </w:rPr>
             </w:pPr>
             <w:r>
               <w:rPr>
                 <w:rFonts w:cs="Times New Roman"/>
                 <w:color w:val="000000"/>
+                <w:sz w:val="20"/>
+                <w:szCs w:val="20"/>
               </w:rPr>
               <w:t>6:</w:t>
             </w:r>
@@ -487,6 +636,8 @@
               <w:spacing w:before="20" w:after="20"/>
               <w:rPr>
                 <w:rFonts w:cs="Times New Roman"/>
+                <w:sz w:val="20"/>
+                <w:szCs w:val="20"/>
               </w:rPr>
             </w:pPr>
             <w:r>
@@ -494,6 +645,8 @@
                 <w:rFonts w:cs="Times New Roman"/>
                 <w:i/>
                 <w:color w:val="000000"/>
+                <w:sz w:val="20"/>
+                <w:szCs w:val="20"/>
               </w:rPr>
               <w:t>analysisResult</w:t>
             </w:r>
@@ -501,16 +654,17 @@
               <w:rPr>
                 <w:rFonts w:cs="Times New Roman"/>
                 <w:color w:val="000000"/>
+                <w:sz w:val="20"/>
+                <w:szCs w:val="20"/>
               </w:rPr>
               <w:t xml:space="preserve"> ← </w:t>
             </w:r>
-            <w:proofErr w:type="gramStart"/>
             <w:r>
               <w:rPr>
                 <w:rFonts w:cs="Times New Roman"/>
-                <w:b/>
-                <w:caps/>
                 <w:color w:val="000000"/>
+                <w:sz w:val="20"/>
+                <w:szCs w:val="20"/>
               </w:rPr>
               <w:t>SLMAnalyze</w:t>
             </w:r>
@@ -518,15 +672,18 @@
               <w:rPr>
                 <w:rFonts w:cs="Times New Roman"/>
                 <w:color w:val="000000"/>
+                <w:sz w:val="20"/>
+                <w:szCs w:val="20"/>
               </w:rPr>
               <w:t>(</w:t>
             </w:r>
-            <w:proofErr w:type="gramEnd"/>
             <w:r>
               <w:rPr>
                 <w:rFonts w:cs="Times New Roman"/>
                 <w:i/>
                 <w:color w:val="000000"/>
+                <w:sz w:val="20"/>
+                <w:szCs w:val="20"/>
               </w:rPr>
               <w:t>digestedContext</w:t>
             </w:r>
@@ -534,6 +691,8 @@
               <w:rPr>
                 <w:rFonts w:cs="Times New Roman"/>
                 <w:color w:val="000000"/>
+                <w:sz w:val="20"/>
+                <w:szCs w:val="20"/>
               </w:rPr>
               <w:t xml:space="preserve">, </w:t>
             </w:r>
@@ -542,6 +701,8 @@
                 <w:rFonts w:cs="Times New Roman"/>
                 <w:i/>
                 <w:color w:val="000000"/>
+                <w:sz w:val="20"/>
+                <w:szCs w:val="20"/>
               </w:rPr>
               <w:t>taskExists</w:t>
             </w:r>
@@ -549,6 +710,8 @@
               <w:rPr>
                 <w:rFonts w:cs="Times New Roman"/>
                 <w:color w:val="000000"/>
+                <w:sz w:val="20"/>
+                <w:szCs w:val="20"/>
               </w:rPr>
               <w:t xml:space="preserve">, </w:t>
             </w:r>
@@ -557,6 +720,8 @@
                 <w:rFonts w:cs="Times New Roman"/>
                 <w:i/>
                 <w:color w:val="000000"/>
+                <w:sz w:val="20"/>
+                <w:szCs w:val="20"/>
               </w:rPr>
               <w:t>queue</w:t>
             </w:r>
@@ -564,6 +729,8 @@
               <w:rPr>
                 <w:rFonts w:cs="Times New Roman"/>
                 <w:color w:val="000000"/>
+                <w:sz w:val="20"/>
+                <w:szCs w:val="20"/>
               </w:rPr>
               <w:t>)</w:t>
             </w:r>
@@ -580,6 +747,8 @@
               <w:spacing w:before="20" w:after="20"/>
               <w:rPr>
                 <w:rFonts w:cs="Times New Roman"/>
+                <w:sz w:val="20"/>
+                <w:szCs w:val="20"/>
               </w:rPr>
             </w:pPr>
           </w:p>
@@ -593,6 +762,8 @@
               <w:spacing w:before="20" w:after="20"/>
               <w:rPr>
                 <w:rFonts w:cs="Times New Roman"/>
+                <w:sz w:val="20"/>
+                <w:szCs w:val="20"/>
               </w:rPr>
             </w:pPr>
             <w:r>
@@ -600,8 +771,10 @@
                 <w:rFonts w:cs="Times New Roman"/>
                 <w:i/>
                 <w:color w:val="808080"/>
-              </w:rPr>
-              <w:t xml:space="preserve">    // Step 4: Verdict / classification call</w:t>
+                <w:sz w:val="20"/>
+                <w:szCs w:val="20"/>
+              </w:rPr>
+              <w:t xml:space="preserve">    // Verdict call</w:t>
             </w:r>
           </w:p>
         </w:tc>
@@ -616,12 +789,16 @@
               <w:spacing w:before="20" w:after="20"/>
               <w:rPr>
                 <w:rFonts w:cs="Times New Roman"/>
+                <w:sz w:val="20"/>
+                <w:szCs w:val="20"/>
               </w:rPr>
             </w:pPr>
             <w:r>
               <w:rPr>
                 <w:rFonts w:cs="Times New Roman"/>
                 <w:color w:val="000000"/>
+                <w:sz w:val="20"/>
+                <w:szCs w:val="20"/>
               </w:rPr>
               <w:t>7:</w:t>
             </w:r>
@@ -636,6 +813,8 @@
               <w:spacing w:before="20" w:after="20"/>
               <w:rPr>
                 <w:rFonts w:cs="Times New Roman"/>
+                <w:sz w:val="20"/>
+                <w:szCs w:val="20"/>
               </w:rPr>
             </w:pPr>
             <w:r>
@@ -643,6 +822,8 @@
                 <w:rFonts w:cs="Times New Roman"/>
                 <w:i/>
                 <w:color w:val="000000"/>
+                <w:sz w:val="20"/>
+                <w:szCs w:val="20"/>
               </w:rPr>
               <w:t>route</w:t>
             </w:r>
@@ -650,32 +831,36 @@
               <w:rPr>
                 <w:rFonts w:cs="Times New Roman"/>
                 <w:color w:val="000000"/>
-              </w:rPr>
-              <w:t xml:space="preserve"> ← </w:t>
-            </w:r>
-            <w:proofErr w:type="gramStart"/>
-            <w:r>
-              <w:rPr>
-                <w:rFonts w:cs="Times New Roman"/>
-                <w:b/>
-                <w:caps/>
-                <w:color w:val="000000"/>
-              </w:rPr>
-              <w:t>Classify</w:t>
+                <w:sz w:val="20"/>
+                <w:szCs w:val="20"/>
+              </w:rPr>
+              <w:t xml:space="preserve"> ←</w:t>
             </w:r>
             <w:r>
               <w:rPr>
                 <w:rFonts w:cs="Times New Roman"/>
                 <w:color w:val="000000"/>
+                <w:sz w:val="20"/>
+                <w:szCs w:val="20"/>
+              </w:rPr>
+              <w:t xml:space="preserve"> Classify</w:t>
+            </w:r>
+            <w:r>
+              <w:rPr>
+                <w:rFonts w:cs="Times New Roman"/>
+                <w:color w:val="000000"/>
+                <w:sz w:val="20"/>
+                <w:szCs w:val="20"/>
               </w:rPr>
               <w:t>(</w:t>
             </w:r>
-            <w:proofErr w:type="gramEnd"/>
             <w:r>
               <w:rPr>
                 <w:rFonts w:cs="Times New Roman"/>
                 <w:i/>
                 <w:color w:val="000000"/>
+                <w:sz w:val="20"/>
+                <w:szCs w:val="20"/>
               </w:rPr>
               <w:t>analysisResult</w:t>
             </w:r>
@@ -683,6 +868,8 @@
               <w:rPr>
                 <w:rFonts w:cs="Times New Roman"/>
                 <w:color w:val="000000"/>
+                <w:sz w:val="20"/>
+                <w:szCs w:val="20"/>
               </w:rPr>
               <w:t xml:space="preserve">, </w:t>
             </w:r>
@@ -691,6 +878,8 @@
                 <w:rFonts w:cs="Times New Roman"/>
                 <w:i/>
                 <w:color w:val="000000"/>
+                <w:sz w:val="20"/>
+                <w:szCs w:val="20"/>
               </w:rPr>
               <w:t>taskExists</w:t>
             </w:r>
@@ -698,15 +887,18 @@
               <w:rPr>
                 <w:rFonts w:cs="Times New Roman"/>
                 <w:color w:val="000000"/>
+                <w:sz w:val="20"/>
+                <w:szCs w:val="20"/>
               </w:rPr>
               <w:t xml:space="preserve">, </w:t>
             </w:r>
-            <w:proofErr w:type="gramStart"/>
             <w:r>
               <w:rPr>
                 <w:rFonts w:cs="Times New Roman"/>
                 <w:i/>
                 <w:color w:val="000000"/>
+                <w:sz w:val="20"/>
+                <w:szCs w:val="20"/>
               </w:rPr>
               <w:t>queue</w:t>
             </w:r>
@@ -714,25 +906,10 @@
               <w:rPr>
                 <w:rFonts w:cs="Times New Roman"/>
                 <w:color w:val="000000"/>
-              </w:rPr>
-              <w:t>.</w:t>
-            </w:r>
-            <w:r>
-              <w:rPr>
-                <w:rFonts w:cs="Times New Roman"/>
-                <w:b/>
-                <w:caps/>
-                <w:color w:val="000000"/>
-              </w:rPr>
-              <w:t>hasWorkerSpawnedNodes</w:t>
-            </w:r>
-            <w:proofErr w:type="gramEnd"/>
-            <w:r>
-              <w:rPr>
-                <w:rFonts w:cs="Times New Roman"/>
-                <w:color w:val="000000"/>
-              </w:rPr>
-              <w:t>())</w:t>
+                <w:sz w:val="20"/>
+                <w:szCs w:val="20"/>
+              </w:rPr>
+              <w:t>)</w:t>
             </w:r>
           </w:p>
         </w:tc>
@@ -747,6 +924,8 @@
               <w:spacing w:before="20" w:after="20"/>
               <w:rPr>
                 <w:rFonts w:cs="Times New Roman"/>
+                <w:sz w:val="20"/>
+                <w:szCs w:val="20"/>
               </w:rPr>
             </w:pPr>
           </w:p>
@@ -760,6 +939,8 @@
               <w:spacing w:before="20" w:after="20"/>
               <w:rPr>
                 <w:rFonts w:cs="Times New Roman"/>
+                <w:sz w:val="20"/>
+                <w:szCs w:val="20"/>
               </w:rPr>
             </w:pPr>
             <w:r>
@@ -767,8 +948,10 @@
                 <w:rFonts w:cs="Times New Roman"/>
                 <w:i/>
                 <w:color w:val="808080"/>
-              </w:rPr>
-              <w:t xml:space="preserve">    // Step 5: Dispatch via route map</w:t>
+                <w:sz w:val="20"/>
+                <w:szCs w:val="20"/>
+              </w:rPr>
+              <w:t xml:space="preserve">    // Dispatch via route map</w:t>
             </w:r>
           </w:p>
         </w:tc>
@@ -783,12 +966,16 @@
               <w:spacing w:before="20" w:after="20"/>
               <w:rPr>
                 <w:rFonts w:cs="Times New Roman"/>
+                <w:sz w:val="20"/>
+                <w:szCs w:val="20"/>
               </w:rPr>
             </w:pPr>
             <w:r>
               <w:rPr>
                 <w:rFonts w:cs="Times New Roman"/>
                 <w:color w:val="000000"/>
+                <w:sz w:val="20"/>
+                <w:szCs w:val="20"/>
               </w:rPr>
               <w:t>8:</w:t>
             </w:r>
@@ -803,6 +990,8 @@
               <w:spacing w:before="20" w:after="20"/>
               <w:rPr>
                 <w:rFonts w:cs="Times New Roman"/>
+                <w:sz w:val="20"/>
+                <w:szCs w:val="20"/>
               </w:rPr>
             </w:pPr>
             <w:r>
@@ -810,6 +999,8 @@
                 <w:rFonts w:cs="Times New Roman"/>
                 <w:b/>
                 <w:color w:val="000000"/>
+                <w:sz w:val="20"/>
+                <w:szCs w:val="20"/>
               </w:rPr>
               <w:t>if</w:t>
             </w:r>
@@ -817,6 +1008,8 @@
               <w:rPr>
                 <w:rFonts w:cs="Times New Roman"/>
                 <w:color w:val="000000"/>
+                <w:sz w:val="20"/>
+                <w:szCs w:val="20"/>
               </w:rPr>
               <w:t xml:space="preserve"> </w:t>
             </w:r>
@@ -825,6 +1018,8 @@
                 <w:rFonts w:cs="Times New Roman"/>
                 <w:i/>
                 <w:color w:val="000000"/>
+                <w:sz w:val="20"/>
+                <w:szCs w:val="20"/>
               </w:rPr>
               <w:t>route</w:t>
             </w:r>
@@ -832,6 +1027,8 @@
               <w:rPr>
                 <w:rFonts w:cs="Times New Roman"/>
                 <w:color w:val="000000"/>
+                <w:sz w:val="20"/>
+                <w:szCs w:val="20"/>
               </w:rPr>
               <w:t xml:space="preserve"> = </w:t>
             </w:r>
@@ -840,6 +1037,8 @@
                 <w:rFonts w:cs="Times New Roman"/>
                 <w:b/>
                 <w:color w:val="000000"/>
+                <w:sz w:val="20"/>
+                <w:szCs w:val="20"/>
               </w:rPr>
               <w:t>task_creation</w:t>
             </w:r>
@@ -847,6 +1046,8 @@
               <w:rPr>
                 <w:rFonts w:cs="Times New Roman"/>
                 <w:color w:val="000000"/>
+                <w:sz w:val="20"/>
+                <w:szCs w:val="20"/>
               </w:rPr>
               <w:t xml:space="preserve"> </w:t>
             </w:r>
@@ -855,6 +1056,8 @@
                 <w:rFonts w:cs="Times New Roman"/>
                 <w:b/>
                 <w:color w:val="000000"/>
+                <w:sz w:val="20"/>
+                <w:szCs w:val="20"/>
               </w:rPr>
               <w:t>then</w:t>
             </w:r>
@@ -871,12 +1074,16 @@
               <w:spacing w:before="20" w:after="20"/>
               <w:rPr>
                 <w:rFonts w:cs="Times New Roman"/>
+                <w:sz w:val="20"/>
+                <w:szCs w:val="20"/>
               </w:rPr>
             </w:pPr>
             <w:r>
               <w:rPr>
                 <w:rFonts w:cs="Times New Roman"/>
                 <w:color w:val="000000"/>
+                <w:sz w:val="20"/>
+                <w:szCs w:val="20"/>
               </w:rPr>
               <w:t>9:</w:t>
             </w:r>
@@ -891,12 +1098,16 @@
               <w:spacing w:before="20" w:after="20"/>
               <w:rPr>
                 <w:rFonts w:cs="Times New Roman"/>
+                <w:sz w:val="20"/>
+                <w:szCs w:val="20"/>
               </w:rPr>
             </w:pPr>
             <w:r>
               <w:rPr>
                 <w:rFonts w:cs="Times New Roman"/>
                 <w:color w:val="000000"/>
+                <w:sz w:val="20"/>
+                <w:szCs w:val="20"/>
               </w:rPr>
               <w:t xml:space="preserve">    </w:t>
             </w:r>
@@ -905,6 +1116,8 @@
                 <w:rFonts w:cs="Times New Roman"/>
                 <w:i/>
                 <w:color w:val="000000"/>
+                <w:sz w:val="20"/>
+                <w:szCs w:val="20"/>
               </w:rPr>
               <w:t>queue</w:t>
             </w:r>
@@ -912,102 +1125,37 @@
               <w:rPr>
                 <w:rFonts w:cs="Times New Roman"/>
                 <w:color w:val="000000"/>
+                <w:sz w:val="20"/>
+                <w:szCs w:val="20"/>
               </w:rPr>
               <w:t xml:space="preserve"> ← [</w:t>
             </w:r>
             <w:r>
               <w:rPr>
                 <w:rFonts w:cs="Times New Roman"/>
+                <w:color w:val="000000"/>
+                <w:sz w:val="20"/>
+                <w:szCs w:val="20"/>
+              </w:rPr>
+              <w:t>TaskCreation, TaskAnalyzer,</w:t>
+            </w:r>
+            <w:r>
+              <w:rPr>
+                <w:rFonts w:cs="Times New Roman"/>
                 <w:b/>
                 <w:caps/>
                 <w:color w:val="000000"/>
-              </w:rPr>
-              <w:t>TaskCreate</w:t>
+                <w:sz w:val="20"/>
+                <w:szCs w:val="20"/>
+              </w:rPr>
+              <w:t xml:space="preserve"> …</w:t>
             </w:r>
             <w:r>
               <w:rPr>
                 <w:rFonts w:cs="Times New Roman"/>
                 <w:color w:val="000000"/>
-              </w:rPr>
-              <w:t xml:space="preserve">, </w:t>
-            </w:r>
-            <w:r>
-              <w:rPr>
-                <w:rFonts w:cs="Times New Roman"/>
-                <w:b/>
-                <w:caps/>
-                <w:color w:val="000000"/>
-              </w:rPr>
-              <w:t>TaskAnalyzer</w:t>
-            </w:r>
-            <w:r>
-              <w:rPr>
-                <w:rFonts w:cs="Times New Roman"/>
-                <w:color w:val="000000"/>
-              </w:rPr>
-              <w:t xml:space="preserve">, </w:t>
-            </w:r>
-            <w:r>
-              <w:rPr>
-                <w:rFonts w:cs="Times New Roman"/>
-                <w:b/>
-                <w:caps/>
-                <w:color w:val="000000"/>
-              </w:rPr>
-              <w:t>AnalysisEffort</w:t>
-            </w:r>
-            <w:r>
-              <w:rPr>
-                <w:rFonts w:cs="Times New Roman"/>
-                <w:color w:val="000000"/>
-              </w:rPr>
-              <w:t xml:space="preserve">, </w:t>
-            </w:r>
-            <w:r>
-              <w:rPr>
-                <w:rFonts w:cs="Times New Roman"/>
-                <w:b/>
-                <w:caps/>
-                <w:color w:val="000000"/>
-              </w:rPr>
-              <w:t>TaskExecutor</w:t>
-            </w:r>
-            <w:r>
-              <w:rPr>
-                <w:rFonts w:cs="Times New Roman"/>
-                <w:color w:val="000000"/>
-              </w:rPr>
-              <w:t xml:space="preserve">, </w:t>
-            </w:r>
-            <w:r>
-              <w:rPr>
-                <w:rFonts w:cs="Times New Roman"/>
-                <w:b/>
-                <w:caps/>
-                <w:color w:val="000000"/>
-              </w:rPr>
-              <w:t>ResultReviewer</w:t>
-            </w:r>
-            <w:r>
-              <w:rPr>
-                <w:rFonts w:cs="Times New Roman"/>
-                <w:color w:val="000000"/>
-              </w:rPr>
-              <w:t xml:space="preserve">, </w:t>
-            </w:r>
-            <w:r>
-              <w:rPr>
-                <w:rFonts w:cs="Times New Roman"/>
-                <w:b/>
-                <w:caps/>
-                <w:color w:val="000000"/>
-              </w:rPr>
-              <w:t>Response</w:t>
-            </w:r>
-            <w:r>
-              <w:rPr>
-                <w:rFonts w:cs="Times New Roman"/>
-                <w:color w:val="000000"/>
+                <w:sz w:val="20"/>
+                <w:szCs w:val="20"/>
               </w:rPr>
               <w:t>]</w:t>
             </w:r>
@@ -1024,12 +1172,16 @@
               <w:spacing w:before="20" w:after="20"/>
               <w:rPr>
                 <w:rFonts w:cs="Times New Roman"/>
+                <w:sz w:val="20"/>
+                <w:szCs w:val="20"/>
               </w:rPr>
             </w:pPr>
             <w:r>
               <w:rPr>
                 <w:rFonts w:cs="Times New Roman"/>
                 <w:color w:val="000000"/>
+                <w:sz w:val="20"/>
+                <w:szCs w:val="20"/>
               </w:rPr>
               <w:t>10:</w:t>
             </w:r>
@@ -1044,6 +1196,8 @@
               <w:spacing w:before="20" w:after="20"/>
               <w:rPr>
                 <w:rFonts w:cs="Times New Roman"/>
+                <w:sz w:val="20"/>
+                <w:szCs w:val="20"/>
               </w:rPr>
             </w:pPr>
             <w:r>
@@ -1051,6 +1205,8 @@
                 <w:rFonts w:cs="Times New Roman"/>
                 <w:b/>
                 <w:color w:val="000000"/>
+                <w:sz w:val="20"/>
+                <w:szCs w:val="20"/>
               </w:rPr>
               <w:t>else if</w:t>
             </w:r>
@@ -1058,6 +1214,8 @@
               <w:rPr>
                 <w:rFonts w:cs="Times New Roman"/>
                 <w:color w:val="000000"/>
+                <w:sz w:val="20"/>
+                <w:szCs w:val="20"/>
               </w:rPr>
               <w:t xml:space="preserve"> </w:t>
             </w:r>
@@ -1066,6 +1224,8 @@
                 <w:rFonts w:cs="Times New Roman"/>
                 <w:i/>
                 <w:color w:val="000000"/>
+                <w:sz w:val="20"/>
+                <w:szCs w:val="20"/>
               </w:rPr>
               <w:t>route</w:t>
             </w:r>
@@ -1073,6 +1233,8 @@
               <w:rPr>
                 <w:rFonts w:cs="Times New Roman"/>
                 <w:color w:val="000000"/>
+                <w:sz w:val="20"/>
+                <w:szCs w:val="20"/>
               </w:rPr>
               <w:t xml:space="preserve"> = </w:t>
             </w:r>
@@ -1081,6 +1243,8 @@
                 <w:rFonts w:cs="Times New Roman"/>
                 <w:b/>
                 <w:color w:val="000000"/>
+                <w:sz w:val="20"/>
+                <w:szCs w:val="20"/>
               </w:rPr>
               <w:t>task_recreation</w:t>
             </w:r>
@@ -1088,6 +1252,8 @@
               <w:rPr>
                 <w:rFonts w:cs="Times New Roman"/>
                 <w:color w:val="000000"/>
+                <w:sz w:val="20"/>
+                <w:szCs w:val="20"/>
               </w:rPr>
               <w:t xml:space="preserve"> </w:t>
             </w:r>
@@ -1096,6 +1262,8 @@
                 <w:rFonts w:cs="Times New Roman"/>
                 <w:b/>
                 <w:color w:val="000000"/>
+                <w:sz w:val="20"/>
+                <w:szCs w:val="20"/>
               </w:rPr>
               <w:t>then</w:t>
             </w:r>
@@ -1112,12 +1280,16 @@
               <w:spacing w:before="20" w:after="20"/>
               <w:rPr>
                 <w:rFonts w:cs="Times New Roman"/>
+                <w:sz w:val="20"/>
+                <w:szCs w:val="20"/>
               </w:rPr>
             </w:pPr>
             <w:r>
               <w:rPr>
                 <w:rFonts w:cs="Times New Roman"/>
                 <w:color w:val="000000"/>
+                <w:sz w:val="20"/>
+                <w:szCs w:val="20"/>
               </w:rPr>
               <w:t>11:</w:t>
             </w:r>
@@ -1132,11 +1304,15 @@
               <w:spacing w:before="20" w:after="20"/>
               <w:rPr>
                 <w:rFonts w:cs="Times New Roman"/>
+                <w:sz w:val="20"/>
+                <w:szCs w:val="20"/>
               </w:rPr>
             </w:pPr>
             <w:r>
               <w:rPr>
                 <w:rFonts w:cs="Times New Roman"/>
+                <w:sz w:val="20"/>
+                <w:szCs w:val="20"/>
               </w:rPr>
               <w:t xml:space="preserve">    remove all nodes after Worker from queue</w:t>
             </w:r>
@@ -1153,12 +1329,16 @@
               <w:spacing w:before="20" w:after="20"/>
               <w:rPr>
                 <w:rFonts w:cs="Times New Roman"/>
+                <w:sz w:val="20"/>
+                <w:szCs w:val="20"/>
               </w:rPr>
             </w:pPr>
             <w:r>
               <w:rPr>
                 <w:rFonts w:cs="Times New Roman"/>
                 <w:color w:val="000000"/>
+                <w:sz w:val="20"/>
+                <w:szCs w:val="20"/>
               </w:rPr>
               <w:t>12:</w:t>
             </w:r>
@@ -1173,12 +1353,16 @@
               <w:spacing w:before="20" w:after="20"/>
               <w:rPr>
                 <w:rFonts w:cs="Times New Roman"/>
+                <w:sz w:val="20"/>
+                <w:szCs w:val="20"/>
               </w:rPr>
             </w:pPr>
             <w:r>
               <w:rPr>
                 <w:rFonts w:cs="Times New Roman"/>
                 <w:color w:val="000000"/>
+                <w:sz w:val="20"/>
+                <w:szCs w:val="20"/>
               </w:rPr>
               <w:t xml:space="preserve">    </w:t>
             </w:r>
@@ -1187,6 +1371,8 @@
                 <w:rFonts w:cs="Times New Roman"/>
                 <w:i/>
                 <w:color w:val="000000"/>
+                <w:sz w:val="20"/>
+                <w:szCs w:val="20"/>
               </w:rPr>
               <w:t>queue</w:t>
             </w:r>
@@ -1194,102 +1380,26 @@
               <w:rPr>
                 <w:rFonts w:cs="Times New Roman"/>
                 <w:color w:val="000000"/>
+                <w:sz w:val="20"/>
+                <w:szCs w:val="20"/>
               </w:rPr>
               <w:t xml:space="preserve"> ← [</w:t>
             </w:r>
             <w:r>
               <w:rPr>
                 <w:rFonts w:cs="Times New Roman"/>
-                <w:b/>
-                <w:caps/>
                 <w:color w:val="000000"/>
-              </w:rPr>
-              <w:t>TaskAnalyzer</w:t>
+                <w:sz w:val="20"/>
+                <w:szCs w:val="20"/>
+              </w:rPr>
+              <w:t>TaskAnalyzer (init), AnalysisEffort, TaskExecutor, …</w:t>
             </w:r>
             <w:r>
               <w:rPr>
                 <w:rFonts w:cs="Times New Roman"/>
                 <w:color w:val="000000"/>
-              </w:rPr>
-              <w:t>(</w:t>
-            </w:r>
-            <w:r>
-              <w:rPr>
-                <w:rFonts w:cs="Times New Roman"/>
-                <w:b/>
-                <w:caps/>
-                <w:color w:val="000000"/>
-              </w:rPr>
-              <w:t>TaskInit</w:t>
-            </w:r>
-            <w:r>
-              <w:rPr>
-                <w:rFonts w:cs="Times New Roman"/>
-                <w:color w:val="000000"/>
-              </w:rPr>
-              <w:t xml:space="preserve">), </w:t>
-            </w:r>
-            <w:r>
-              <w:rPr>
-                <w:rFonts w:cs="Times New Roman"/>
-                <w:b/>
-                <w:caps/>
-                <w:color w:val="000000"/>
-              </w:rPr>
-              <w:t>AnalysisEffort</w:t>
-            </w:r>
-            <w:r>
-              <w:rPr>
-                <w:rFonts w:cs="Times New Roman"/>
-                <w:color w:val="000000"/>
-              </w:rPr>
-              <w:t xml:space="preserve">, </w:t>
-            </w:r>
-            <w:r>
-              <w:rPr>
-                <w:rFonts w:cs="Times New Roman"/>
-                <w:b/>
-                <w:caps/>
-                <w:color w:val="000000"/>
-              </w:rPr>
-              <w:t>TaskExecutor</w:t>
-            </w:r>
-            <w:r>
-              <w:rPr>
-                <w:rFonts w:cs="Times New Roman"/>
-                <w:color w:val="000000"/>
-              </w:rPr>
-              <w:t xml:space="preserve">, </w:t>
-            </w:r>
-            <w:r>
-              <w:rPr>
-                <w:rFonts w:cs="Times New Roman"/>
-                <w:b/>
-                <w:caps/>
-                <w:color w:val="000000"/>
-              </w:rPr>
-              <w:t>ResultReviewer</w:t>
-            </w:r>
-            <w:r>
-              <w:rPr>
-                <w:rFonts w:cs="Times New Roman"/>
-                <w:color w:val="000000"/>
-              </w:rPr>
-              <w:t xml:space="preserve">, </w:t>
-            </w:r>
-            <w:r>
-              <w:rPr>
-                <w:rFonts w:cs="Times New Roman"/>
-                <w:b/>
-                <w:caps/>
-                <w:color w:val="000000"/>
-              </w:rPr>
-              <w:t>Response</w:t>
-            </w:r>
-            <w:r>
-              <w:rPr>
-                <w:rFonts w:cs="Times New Roman"/>
-                <w:color w:val="000000"/>
+                <w:sz w:val="20"/>
+                <w:szCs w:val="20"/>
               </w:rPr>
               <w:t>]</w:t>
             </w:r>
@@ -1306,12 +1416,16 @@
               <w:spacing w:before="20" w:after="20"/>
               <w:rPr>
                 <w:rFonts w:cs="Times New Roman"/>
+                <w:sz w:val="20"/>
+                <w:szCs w:val="20"/>
               </w:rPr>
             </w:pPr>
             <w:r>
               <w:rPr>
                 <w:rFonts w:cs="Times New Roman"/>
                 <w:color w:val="000000"/>
+                <w:sz w:val="20"/>
+                <w:szCs w:val="20"/>
               </w:rPr>
               <w:t>13:</w:t>
             </w:r>
@@ -1326,6 +1440,8 @@
               <w:spacing w:before="20" w:after="20"/>
               <w:rPr>
                 <w:rFonts w:cs="Times New Roman"/>
+                <w:sz w:val="20"/>
+                <w:szCs w:val="20"/>
               </w:rPr>
             </w:pPr>
             <w:r>
@@ -1333,6 +1449,8 @@
                 <w:rFonts w:cs="Times New Roman"/>
                 <w:b/>
                 <w:color w:val="000000"/>
+                <w:sz w:val="20"/>
+                <w:szCs w:val="20"/>
               </w:rPr>
               <w:t>else if</w:t>
             </w:r>
@@ -1340,6 +1458,8 @@
               <w:rPr>
                 <w:rFonts w:cs="Times New Roman"/>
                 <w:color w:val="000000"/>
+                <w:sz w:val="20"/>
+                <w:szCs w:val="20"/>
               </w:rPr>
               <w:t xml:space="preserve"> </w:t>
             </w:r>
@@ -1348,6 +1468,8 @@
                 <w:rFonts w:cs="Times New Roman"/>
                 <w:i/>
                 <w:color w:val="000000"/>
+                <w:sz w:val="20"/>
+                <w:szCs w:val="20"/>
               </w:rPr>
               <w:t>route</w:t>
             </w:r>
@@ -1355,6 +1477,8 @@
               <w:rPr>
                 <w:rFonts w:cs="Times New Roman"/>
                 <w:color w:val="000000"/>
+                <w:sz w:val="20"/>
+                <w:szCs w:val="20"/>
               </w:rPr>
               <w:t xml:space="preserve"> = </w:t>
             </w:r>
@@ -1363,6 +1487,8 @@
                 <w:rFonts w:cs="Times New Roman"/>
                 <w:b/>
                 <w:color w:val="000000"/>
+                <w:sz w:val="20"/>
+                <w:szCs w:val="20"/>
               </w:rPr>
               <w:t>task_reanalysis</w:t>
             </w:r>
@@ -1370,6 +1496,8 @@
               <w:rPr>
                 <w:rFonts w:cs="Times New Roman"/>
                 <w:color w:val="000000"/>
+                <w:sz w:val="20"/>
+                <w:szCs w:val="20"/>
               </w:rPr>
               <w:t xml:space="preserve"> </w:t>
             </w:r>
@@ -1378,6 +1506,8 @@
                 <w:rFonts w:cs="Times New Roman"/>
                 <w:b/>
                 <w:color w:val="000000"/>
+                <w:sz w:val="20"/>
+                <w:szCs w:val="20"/>
               </w:rPr>
               <w:t>then</w:t>
             </w:r>
@@ -1394,12 +1524,16 @@
               <w:spacing w:before="20" w:after="20"/>
               <w:rPr>
                 <w:rFonts w:cs="Times New Roman"/>
+                <w:sz w:val="20"/>
+                <w:szCs w:val="20"/>
               </w:rPr>
             </w:pPr>
             <w:r>
               <w:rPr>
                 <w:rFonts w:cs="Times New Roman"/>
                 <w:color w:val="000000"/>
+                <w:sz w:val="20"/>
+                <w:szCs w:val="20"/>
               </w:rPr>
               <w:t>14:</w:t>
             </w:r>
@@ -1414,11 +1548,15 @@
               <w:spacing w:before="20" w:after="20"/>
               <w:rPr>
                 <w:rFonts w:cs="Times New Roman"/>
+                <w:sz w:val="20"/>
+                <w:szCs w:val="20"/>
               </w:rPr>
             </w:pPr>
             <w:r>
               <w:rPr>
                 <w:rFonts w:cs="Times New Roman"/>
+                <w:sz w:val="20"/>
+                <w:szCs w:val="20"/>
               </w:rPr>
               <w:t xml:space="preserve">    remove all nodes after Worker from queue</w:t>
             </w:r>
@@ -1435,12 +1573,16 @@
               <w:spacing w:before="20" w:after="20"/>
               <w:rPr>
                 <w:rFonts w:cs="Times New Roman"/>
+                <w:sz w:val="20"/>
+                <w:szCs w:val="20"/>
               </w:rPr>
             </w:pPr>
             <w:r>
               <w:rPr>
                 <w:rFonts w:cs="Times New Roman"/>
                 <w:color w:val="000000"/>
+                <w:sz w:val="20"/>
+                <w:szCs w:val="20"/>
               </w:rPr>
               <w:t>15:</w:t>
             </w:r>
@@ -1455,12 +1597,16 @@
               <w:spacing w:before="20" w:after="20"/>
               <w:rPr>
                 <w:rFonts w:cs="Times New Roman"/>
+                <w:sz w:val="20"/>
+                <w:szCs w:val="20"/>
               </w:rPr>
             </w:pPr>
             <w:r>
               <w:rPr>
                 <w:rFonts w:cs="Times New Roman"/>
                 <w:color w:val="000000"/>
+                <w:sz w:val="20"/>
+                <w:szCs w:val="20"/>
               </w:rPr>
               <w:t xml:space="preserve">    </w:t>
             </w:r>
@@ -1469,6 +1615,8 @@
                 <w:rFonts w:cs="Times New Roman"/>
                 <w:i/>
                 <w:color w:val="000000"/>
+                <w:sz w:val="20"/>
+                <w:szCs w:val="20"/>
               </w:rPr>
               <w:t>queue</w:t>
             </w:r>
@@ -1476,86 +1624,26 @@
               <w:rPr>
                 <w:rFonts w:cs="Times New Roman"/>
                 <w:color w:val="000000"/>
-              </w:rPr>
-              <w:t xml:space="preserve"> ← [</w:t>
+                <w:sz w:val="20"/>
+                <w:szCs w:val="20"/>
+              </w:rPr>
+              <w:t xml:space="preserve"> ← </w:t>
             </w:r>
             <w:r>
               <w:rPr>
                 <w:rFonts w:cs="Times New Roman"/>
-                <w:b/>
-                <w:caps/>
                 <w:color w:val="000000"/>
-              </w:rPr>
-              <w:t>TaskAnalyzer</w:t>
+                <w:sz w:val="20"/>
+                <w:szCs w:val="20"/>
+              </w:rPr>
+              <w:t>[TaskAnalyzer, AnalysisEffort, TaskExecutor, …</w:t>
             </w:r>
             <w:r>
               <w:rPr>
                 <w:rFonts w:cs="Times New Roman"/>
                 <w:color w:val="000000"/>
-              </w:rPr>
-              <w:t xml:space="preserve">, </w:t>
-            </w:r>
-            <w:r>
-              <w:rPr>
-                <w:rFonts w:cs="Times New Roman"/>
-                <w:b/>
-                <w:caps/>
-                <w:color w:val="000000"/>
-              </w:rPr>
-              <w:t>AnalysisEffort</w:t>
-            </w:r>
-            <w:r>
-              <w:rPr>
-                <w:rFonts w:cs="Times New Roman"/>
-                <w:color w:val="000000"/>
-              </w:rPr>
-              <w:t xml:space="preserve">, </w:t>
-            </w:r>
-            <w:r>
-              <w:rPr>
-                <w:rFonts w:cs="Times New Roman"/>
-                <w:b/>
-                <w:caps/>
-                <w:color w:val="000000"/>
-              </w:rPr>
-              <w:t>TaskExecutor</w:t>
-            </w:r>
-            <w:r>
-              <w:rPr>
-                <w:rFonts w:cs="Times New Roman"/>
-                <w:color w:val="000000"/>
-              </w:rPr>
-              <w:t xml:space="preserve">, </w:t>
-            </w:r>
-            <w:r>
-              <w:rPr>
-                <w:rFonts w:cs="Times New Roman"/>
-                <w:b/>
-                <w:caps/>
-                <w:color w:val="000000"/>
-              </w:rPr>
-              <w:t>ResultReviewer</w:t>
-            </w:r>
-            <w:r>
-              <w:rPr>
-                <w:rFonts w:cs="Times New Roman"/>
-                <w:color w:val="000000"/>
-              </w:rPr>
-              <w:t xml:space="preserve">, </w:t>
-            </w:r>
-            <w:r>
-              <w:rPr>
-                <w:rFonts w:cs="Times New Roman"/>
-                <w:b/>
-                <w:caps/>
-                <w:color w:val="000000"/>
-              </w:rPr>
-              <w:t>Response</w:t>
-            </w:r>
-            <w:r>
-              <w:rPr>
-                <w:rFonts w:cs="Times New Roman"/>
-                <w:color w:val="000000"/>
+                <w:sz w:val="20"/>
+                <w:szCs w:val="20"/>
               </w:rPr>
               <w:t>]</w:t>
             </w:r>
@@ -1572,12 +1660,16 @@
               <w:spacing w:before="20" w:after="20"/>
               <w:rPr>
                 <w:rFonts w:cs="Times New Roman"/>
+                <w:sz w:val="20"/>
+                <w:szCs w:val="20"/>
               </w:rPr>
             </w:pPr>
             <w:r>
               <w:rPr>
                 <w:rFonts w:cs="Times New Roman"/>
                 <w:color w:val="000000"/>
+                <w:sz w:val="20"/>
+                <w:szCs w:val="20"/>
               </w:rPr>
               <w:t>16:</w:t>
             </w:r>
@@ -1592,6 +1684,8 @@
               <w:spacing w:before="20" w:after="20"/>
               <w:rPr>
                 <w:rFonts w:cs="Times New Roman"/>
+                <w:sz w:val="20"/>
+                <w:szCs w:val="20"/>
               </w:rPr>
             </w:pPr>
             <w:r>
@@ -1599,6 +1693,8 @@
                 <w:rFonts w:cs="Times New Roman"/>
                 <w:b/>
                 <w:color w:val="000000"/>
+                <w:sz w:val="20"/>
+                <w:szCs w:val="20"/>
               </w:rPr>
               <w:t>else if</w:t>
             </w:r>
@@ -1606,6 +1702,8 @@
               <w:rPr>
                 <w:rFonts w:cs="Times New Roman"/>
                 <w:color w:val="000000"/>
+                <w:sz w:val="20"/>
+                <w:szCs w:val="20"/>
               </w:rPr>
               <w:t xml:space="preserve"> </w:t>
             </w:r>
@@ -1614,6 +1712,8 @@
                 <w:rFonts w:cs="Times New Roman"/>
                 <w:i/>
                 <w:color w:val="000000"/>
+                <w:sz w:val="20"/>
+                <w:szCs w:val="20"/>
               </w:rPr>
               <w:t>route</w:t>
             </w:r>
@@ -1621,6 +1721,8 @@
               <w:rPr>
                 <w:rFonts w:cs="Times New Roman"/>
                 <w:color w:val="000000"/>
+                <w:sz w:val="20"/>
+                <w:szCs w:val="20"/>
               </w:rPr>
               <w:t xml:space="preserve"> = </w:t>
             </w:r>
@@ -1629,6 +1731,8 @@
                 <w:rFonts w:cs="Times New Roman"/>
                 <w:b/>
                 <w:color w:val="000000"/>
+                <w:sz w:val="20"/>
+                <w:szCs w:val="20"/>
               </w:rPr>
               <w:t>passthrough</w:t>
             </w:r>
@@ -1636,6 +1740,8 @@
               <w:rPr>
                 <w:rFonts w:cs="Times New Roman"/>
                 <w:color w:val="000000"/>
+                <w:sz w:val="20"/>
+                <w:szCs w:val="20"/>
               </w:rPr>
               <w:t xml:space="preserve"> </w:t>
             </w:r>
@@ -1644,6 +1750,8 @@
                 <w:rFonts w:cs="Times New Roman"/>
                 <w:b/>
                 <w:color w:val="000000"/>
+                <w:sz w:val="20"/>
+                <w:szCs w:val="20"/>
               </w:rPr>
               <w:t>then</w:t>
             </w:r>
@@ -1660,12 +1768,16 @@
               <w:spacing w:before="20" w:after="20"/>
               <w:rPr>
                 <w:rFonts w:cs="Times New Roman"/>
+                <w:sz w:val="20"/>
+                <w:szCs w:val="20"/>
               </w:rPr>
             </w:pPr>
             <w:r>
               <w:rPr>
                 <w:rFonts w:cs="Times New Roman"/>
                 <w:color w:val="000000"/>
+                <w:sz w:val="20"/>
+                <w:szCs w:val="20"/>
               </w:rPr>
               <w:t>17:</w:t>
             </w:r>
@@ -1680,12 +1792,16 @@
               <w:spacing w:before="20" w:after="20"/>
               <w:rPr>
                 <w:rFonts w:cs="Times New Roman"/>
+                <w:sz w:val="20"/>
+                <w:szCs w:val="20"/>
               </w:rPr>
             </w:pPr>
             <w:r>
               <w:rPr>
                 <w:rFonts w:cs="Times New Roman"/>
                 <w:color w:val="000000"/>
+                <w:sz w:val="20"/>
+                <w:szCs w:val="20"/>
               </w:rPr>
               <w:t xml:space="preserve">    </w:t>
             </w:r>
@@ -1694,6 +1810,8 @@
                 <w:rFonts w:cs="Times New Roman"/>
                 <w:i/>
                 <w:color w:val="000000"/>
+                <w:sz w:val="20"/>
+                <w:szCs w:val="20"/>
               </w:rPr>
               <w:t>queue</w:t>
             </w:r>
@@ -1701,22 +1819,26 @@
               <w:rPr>
                 <w:rFonts w:cs="Times New Roman"/>
                 <w:color w:val="000000"/>
-              </w:rPr>
-              <w:t xml:space="preserve"> ← [</w:t>
+                <w:sz w:val="20"/>
+                <w:szCs w:val="20"/>
+              </w:rPr>
+              <w:t xml:space="preserve"> ← </w:t>
             </w:r>
             <w:r>
               <w:rPr>
                 <w:rFonts w:cs="Times New Roman"/>
-                <w:b/>
-                <w:caps/>
                 <w:color w:val="000000"/>
-              </w:rPr>
-              <w:t>Response</w:t>
+                <w:sz w:val="20"/>
+                <w:szCs w:val="20"/>
+              </w:rPr>
+              <w:t>[Response</w:t>
             </w:r>
             <w:r>
               <w:rPr>
                 <w:rFonts w:cs="Times New Roman"/>
                 <w:color w:val="000000"/>
+                <w:sz w:val="20"/>
+                <w:szCs w:val="20"/>
               </w:rPr>
               <w:t>]</w:t>
             </w:r>
@@ -1733,12 +1855,16 @@
               <w:spacing w:before="20" w:after="20"/>
               <w:rPr>
                 <w:rFonts w:cs="Times New Roman"/>
+                <w:sz w:val="20"/>
+                <w:szCs w:val="20"/>
               </w:rPr>
             </w:pPr>
             <w:r>
               <w:rPr>
                 <w:rFonts w:cs="Times New Roman"/>
                 <w:color w:val="000000"/>
+                <w:sz w:val="20"/>
+                <w:szCs w:val="20"/>
               </w:rPr>
               <w:t>18:</w:t>
             </w:r>
@@ -1753,6 +1879,8 @@
               <w:spacing w:before="20" w:after="20"/>
               <w:rPr>
                 <w:rFonts w:cs="Times New Roman"/>
+                <w:sz w:val="20"/>
+                <w:szCs w:val="20"/>
               </w:rPr>
             </w:pPr>
             <w:r>
@@ -1760,6 +1888,8 @@
                 <w:rFonts w:cs="Times New Roman"/>
                 <w:b/>
                 <w:color w:val="000000"/>
+                <w:sz w:val="20"/>
+                <w:szCs w:val="20"/>
               </w:rPr>
               <w:t>else if</w:t>
             </w:r>
@@ -1767,6 +1897,8 @@
               <w:rPr>
                 <w:rFonts w:cs="Times New Roman"/>
                 <w:color w:val="000000"/>
+                <w:sz w:val="20"/>
+                <w:szCs w:val="20"/>
               </w:rPr>
               <w:t xml:space="preserve"> </w:t>
             </w:r>
@@ -1775,6 +1907,8 @@
                 <w:rFonts w:cs="Times New Roman"/>
                 <w:i/>
                 <w:color w:val="000000"/>
+                <w:sz w:val="20"/>
+                <w:szCs w:val="20"/>
               </w:rPr>
               <w:t>route</w:t>
             </w:r>
@@ -1782,6 +1916,8 @@
               <w:rPr>
                 <w:rFonts w:cs="Times New Roman"/>
                 <w:color w:val="000000"/>
+                <w:sz w:val="20"/>
+                <w:szCs w:val="20"/>
               </w:rPr>
               <w:t xml:space="preserve"> = </w:t>
             </w:r>
@@ -1790,6 +1926,8 @@
                 <w:rFonts w:cs="Times New Roman"/>
                 <w:b/>
                 <w:color w:val="000000"/>
+                <w:sz w:val="20"/>
+                <w:szCs w:val="20"/>
               </w:rPr>
               <w:t>proceed_execution</w:t>
             </w:r>
@@ -1797,6 +1935,8 @@
               <w:rPr>
                 <w:rFonts w:cs="Times New Roman"/>
                 <w:color w:val="000000"/>
+                <w:sz w:val="20"/>
+                <w:szCs w:val="20"/>
               </w:rPr>
               <w:t xml:space="preserve"> </w:t>
             </w:r>
@@ -1805,6 +1945,8 @@
                 <w:rFonts w:cs="Times New Roman"/>
                 <w:b/>
                 <w:color w:val="000000"/>
+                <w:sz w:val="20"/>
+                <w:szCs w:val="20"/>
               </w:rPr>
               <w:t>then</w:t>
             </w:r>
@@ -1821,12 +1963,16 @@
               <w:spacing w:before="20" w:after="20"/>
               <w:rPr>
                 <w:rFonts w:cs="Times New Roman"/>
+                <w:sz w:val="20"/>
+                <w:szCs w:val="20"/>
               </w:rPr>
             </w:pPr>
             <w:r>
               <w:rPr>
                 <w:rFonts w:cs="Times New Roman"/>
                 <w:color w:val="000000"/>
+                <w:sz w:val="20"/>
+                <w:szCs w:val="20"/>
               </w:rPr>
               <w:t>19:</w:t>
             </w:r>
@@ -1841,12 +1987,16 @@
               <w:spacing w:before="20" w:after="20"/>
               <w:rPr>
                 <w:rFonts w:cs="Times New Roman"/>
+                <w:sz w:val="20"/>
+                <w:szCs w:val="20"/>
               </w:rPr>
             </w:pPr>
             <w:r>
               <w:rPr>
                 <w:rFonts w:cs="Times New Roman"/>
                 <w:color w:val="000000"/>
+                <w:sz w:val="20"/>
+                <w:szCs w:val="20"/>
               </w:rPr>
               <w:t xml:space="preserve">    </w:t>
             </w:r>
@@ -1855,6 +2005,8 @@
                 <w:rFonts w:cs="Times New Roman"/>
                 <w:i/>
                 <w:color w:val="000000"/>
+                <w:sz w:val="20"/>
+                <w:szCs w:val="20"/>
               </w:rPr>
               <w:t>queue</w:t>
             </w:r>
@@ -1862,61 +2014,27 @@
               <w:rPr>
                 <w:rFonts w:cs="Times New Roman"/>
                 <w:color w:val="000000"/>
-              </w:rPr>
-              <w:t xml:space="preserve"> ← [</w:t>
+                <w:sz w:val="20"/>
+                <w:szCs w:val="20"/>
+              </w:rPr>
+              <w:t xml:space="preserve"> ← </w:t>
             </w:r>
             <w:r>
               <w:rPr>
                 <w:rFonts w:cs="Times New Roman"/>
-                <w:b/>
-                <w:caps/>
                 <w:color w:val="000000"/>
-              </w:rPr>
-              <w:t>TaskExecutor</w:t>
-            </w:r>
-            <w:r>
-              <w:rPr>
-                <w:rFonts w:cs="Times New Roman"/>
-                <w:color w:val="000000"/>
-              </w:rPr>
-              <w:t xml:space="preserve">, </w:t>
-            </w:r>
-            <w:r>
-              <w:rPr>
-                <w:rFonts w:cs="Times New Roman"/>
-                <w:b/>
-                <w:caps/>
-                <w:color w:val="000000"/>
-              </w:rPr>
-              <w:t>ResultReviewer</w:t>
-            </w:r>
-            <w:r>
-              <w:rPr>
-                <w:rFonts w:cs="Times New Roman"/>
-                <w:color w:val="000000"/>
-              </w:rPr>
-              <w:t xml:space="preserve">, </w:t>
-            </w:r>
-            <w:r>
-              <w:rPr>
-                <w:rFonts w:cs="Times New Roman"/>
-                <w:b/>
-                <w:caps/>
-                <w:color w:val="000000"/>
-              </w:rPr>
-              <w:t>Response</w:t>
-            </w:r>
-            <w:r>
-              <w:rPr>
-                <w:rFonts w:cs="Times New Roman"/>
-                <w:color w:val="000000"/>
-              </w:rPr>
-              <w:t>]</w:t>
+                <w:sz w:val="20"/>
+                <w:szCs w:val="20"/>
+              </w:rPr>
+              <w:t>[TaskExecutor, ResultReviewer, Response]</w:t>
             </w:r>
           </w:p>
         </w:tc>
       </w:tr>
       <w:tr>
+        <w:trPr>
+          <w:trHeight w:val="65"/>
+        </w:trPr>
         <w:tc>
           <w:tcPr>
             <w:tcW w:w="680" w:type="dxa"/>
@@ -1926,12 +2044,16 @@
               <w:spacing w:before="20" w:after="20"/>
               <w:rPr>
                 <w:rFonts w:cs="Times New Roman"/>
+                <w:sz w:val="20"/>
+                <w:szCs w:val="20"/>
               </w:rPr>
             </w:pPr>
             <w:r>
               <w:rPr>
                 <w:rFonts w:cs="Times New Roman"/>
                 <w:color w:val="000000"/>
+                <w:sz w:val="20"/>
+                <w:szCs w:val="20"/>
               </w:rPr>
               <w:t>20:</w:t>
             </w:r>
@@ -1946,6 +2068,8 @@
               <w:spacing w:before="20" w:after="20"/>
               <w:rPr>
                 <w:rFonts w:cs="Times New Roman"/>
+                <w:sz w:val="20"/>
+                <w:szCs w:val="20"/>
               </w:rPr>
             </w:pPr>
             <w:r>
@@ -1953,6 +2077,8 @@
                 <w:rFonts w:cs="Times New Roman"/>
                 <w:b/>
                 <w:color w:val="000000"/>
+                <w:sz w:val="20"/>
+                <w:szCs w:val="20"/>
               </w:rPr>
               <w:t>end if</w:t>
             </w:r>
@@ -1960,14 +2086,7 @@
         </w:tc>
       </w:tr>
     </w:tbl>
-    <w:p>
-      <w:pPr>
-        <w:pBdr>
-          <w:bottom w:val="single" w:sz="4" w:space="1" w:color="000000"/>
-        </w:pBdr>
-        <w:spacing w:after="0"/>
-      </w:pPr>
-    </w:p>
+    <w:p/>
     <w:sectPr>
       <w:pgSz w:w="12240" w:h="15840"/>
       <w:pgMar w:top="1440" w:right="1440" w:bottom="1440" w:left="1440" w:header="720" w:footer="720" w:gutter="0"/>

</xml_diff>